<commit_message>
5e T1 : fiche 005 « Dispositifs de conversion d'énergie I » (Word et PDF)
Co-Authored-By: Claude Opus 5.5 <noreply@anthropic.com>
Claude-Session: https://claude.ai/code/session_01MXbzGDRQSvh31KmCSLURJ6
</commit_message>
<xml_diff>
--- a/docs/local/DOCX/5eT1/005.docx
+++ b/docs/local/DOCX/5eT1/005.docx
@@ -24,6 +24,7 @@
           </w:tcPr>
           <w:p>
             <w:pPr>
+              <w:spacing w:before="60"/>
               <w:jc w:val="center"/>
               <w:rPr>
                 <w:rFonts w:ascii="Aptos" w:hAnsi="Aptos"/>
@@ -36,17 +37,9 @@
                 <w:color w:val="000000" w:themeColor="text1"/>
               </w:rPr>
               <w:drawing>
-                <wp:anchor distT="0" distB="0" distL="114300" distR="114300" simplePos="0" relativeHeight="251669504" behindDoc="0" locked="0" layoutInCell="1" allowOverlap="1" wp14:anchorId="334AD4FE" wp14:editId="58D9D23D">
-                  <wp:simplePos x="0" y="0"/>
-                  <wp:positionH relativeFrom="column">
-                    <wp:posOffset>207645</wp:posOffset>
-                  </wp:positionH>
-                  <wp:positionV relativeFrom="margin">
-                    <wp:posOffset>63293</wp:posOffset>
-                  </wp:positionV>
+                <wp:inline distT="0" distB="0" distL="0" distR="0">
                   <wp:extent cx="1606550" cy="842645"/>
                   <wp:effectExtent l="0" t="0" r="6350" b="0"/>
-                  <wp:wrapSquare wrapText="bothSides"/>
                   <wp:docPr id="905082273" name="Image 1"/>
                   <wp:cNvGraphicFramePr>
                     <a:graphicFrameLocks xmlns:a="http://schemas.openxmlformats.org/drawingml/2006/main" noChangeAspect="1"/>
@@ -89,24 +82,33 @@
                       </pic:pic>
                     </a:graphicData>
                   </a:graphic>
-                  <wp14:sizeRelH relativeFrom="margin">
-                    <wp14:pctWidth>0</wp14:pctWidth>
-                  </wp14:sizeRelH>
-                  <wp14:sizeRelV relativeFrom="margin">
-                    <wp14:pctHeight>0</wp14:pctHeight>
-                  </wp14:sizeRelV>
-                </wp:anchor>
+                </wp:inline>
               </w:drawing>
             </w:r>
+          </w:p>
+          <w:p>
+            <w:pPr>
+              <w:spacing w:after="120"/>
+              <w:jc w:val="center"/>
+              <w:rPr>
+                <w:rFonts w:ascii="Aptos" w:hAnsi="Aptos"/>
+                <w:sz w:val="20"/>
+                <w:szCs w:val="20"/>
+              </w:rPr>
+            </w:pPr>
             <w:r>
               <w:rPr>
                 <w:rFonts w:ascii="Aptos" w:hAnsi="Aptos"/>
+                <w:sz w:val="20"/>
+                <w:szCs w:val="20"/>
               </w:rPr>
               <w:t>1</w:t>
             </w:r>
             <w:r>
               <w:rPr>
                 <w:rFonts w:ascii="Aptos" w:hAnsi="Aptos"/>
+                <w:sz w:val="20"/>
+                <w:szCs w:val="20"/>
                 <w:vertAlign w:val="superscript"/>
               </w:rPr>
               <w:t>er</w:t>
@@ -114,12 +116,16 @@
             <w:r>
               <w:rPr>
                 <w:rFonts w:ascii="Aptos" w:hAnsi="Aptos"/>
+                <w:sz w:val="20"/>
+                <w:szCs w:val="20"/>
               </w:rPr>
               <w:t xml:space="preserve"> Trimestre | 2026 – 2027 | 5</w:t>
             </w:r>
             <w:r>
               <w:rPr>
                 <w:rFonts w:ascii="Aptos" w:hAnsi="Aptos"/>
+                <w:sz w:val="20"/>
+                <w:szCs w:val="20"/>
                 <w:vertAlign w:val="superscript"/>
               </w:rPr>
               <w:t>e</w:t>
@@ -358,17 +364,7 @@
     </w:tbl>
     <w:p>
       <w:pPr>
-        <w:spacing w:line="276" w:lineRule="auto"/>
-        <w:rPr>
-          <w:rFonts w:ascii="Aptos" w:hAnsi="Aptos"/>
-          <w:sz w:val="21"/>
-          <w:szCs w:val="21"/>
-        </w:rPr>
-      </w:pPr>
-    </w:p>
-    <w:p>
-      <w:pPr>
-        <w:spacing w:line="276" w:lineRule="auto"/>
+        <w:spacing w:before="60" w:after="60" w:line="276" w:lineRule="auto"/>
         <w:jc w:val="center"/>
         <w:rPr>
           <w:rFonts w:ascii="Aptos" w:hAnsi="Aptos"/>
@@ -382,18 +378,8 @@
           <w:sz w:val="28"/>
           <w:szCs w:val="28"/>
         </w:rPr>
-        <w:t>Dispositifs de conversion d’énergie</w:t>
+        <w:t>Dispositifs de conversion d’énergie I</w:t>
       </w:r>
-    </w:p>
-    <w:p>
-      <w:pPr>
-        <w:jc w:val="both"/>
-        <w:rPr>
-          <w:rFonts w:ascii="Calibri" w:hAnsi="Calibri" w:cs="Calibri"/>
-          <w:sz w:val="21"/>
-          <w:szCs w:val="21"/>
-        </w:rPr>
-      </w:pPr>
     </w:p>
     <w:tbl>
       <w:tblPr>
@@ -1193,13 +1179,13 @@
                     <w:drawing>
                       <wp:anchor distT="0" distB="0" distL="114300" distR="114300" simplePos="0" relativeHeight="251737088" behindDoc="1" locked="0" layoutInCell="1" allowOverlap="1" wp14:anchorId="38CFD822" wp14:editId="1161EB83">
                         <wp:simplePos x="0" y="0"/>
-                        <wp:positionH relativeFrom="margin">
-                          <wp:posOffset>73660</wp:posOffset>
+                        <wp:positionH relativeFrom="column">
+                          <wp:align>center</wp:align>
                         </wp:positionH>
                         <wp:positionV relativeFrom="margin">
                           <wp:posOffset>127635</wp:posOffset>
                         </wp:positionV>
-                        <wp:extent cx="6447155" cy="1799590"/>
+                        <wp:extent cx="5480081" cy="1529651"/>
                         <wp:effectExtent l="0" t="0" r="4445" b="3810"/>
                         <wp:wrapSquare wrapText="bothSides"/>
                         <wp:docPr id="1683864698" name="Image 12"/>
@@ -1229,7 +1215,7 @@
                               <pic:spPr bwMode="auto">
                                 <a:xfrm>
                                   <a:off x="0" y="0"/>
-                                  <a:ext cx="6447155" cy="1799590"/>
+                                  <a:ext cx="5480081" cy="1529651"/>
                                 </a:xfrm>
                                 <a:prstGeom prst="rect">
                                   <a:avLst/>
@@ -1275,12 +1261,11 @@
     </w:tbl>
     <w:p>
       <w:pPr>
-        <w:jc w:val="both"/>
+        <w:pageBreakBefore/>
+        <w:spacing w:before="0" w:after="0" w:line="20" w:lineRule="exact"/>
         <w:rPr>
-          <w:rFonts w:asciiTheme="minorHAnsi" w:hAnsiTheme="minorHAnsi" w:cstheme="minorHAnsi"/>
-          <w:sz w:val="16"/>
-          <w:szCs w:val="16"/>
-          <w:u w:val="single"/>
+          <w:sz w:val="2"/>
+          <w:szCs w:val="2"/>
         </w:rPr>
       </w:pPr>
     </w:p>

</xml_diff>

<commit_message>
5e T1 : fiche 005, en-tête centré verticalement (Word et PDF)
Co-Authored-By: Claude Opus 5.5 <noreply@anthropic.com>
Claude-Session: https://claude.ai/code/session_01MXbzGDRQSvh31KmCSLURJ6
</commit_message>
<xml_diff>
--- a/docs/local/DOCX/5eT1/005.docx
+++ b/docs/local/DOCX/5eT1/005.docx
@@ -21,10 +21,11 @@
         <w:tc>
           <w:tcPr>
             <w:tcW w:w="3397" w:type="dxa"/>
+            <w:vAlign w:val="center"/>
           </w:tcPr>
           <w:p>
             <w:pPr>
-              <w:spacing w:before="60"/>
+              <w:spacing w:after="0"/>
               <w:jc w:val="center"/>
               <w:rPr>
                 <w:rFonts w:ascii="Aptos" w:hAnsi="Aptos"/>
@@ -88,7 +89,7 @@
           </w:p>
           <w:p>
             <w:pPr>
-              <w:spacing w:after="120"/>
+              <w:spacing w:after="0"/>
               <w:jc w:val="center"/>
               <w:rPr>
                 <w:rFonts w:ascii="Aptos" w:hAnsi="Aptos"/>

</xml_diff>